<commit_message>
docs: add professor review briefing and add review sections to patent docs
검수자를 지도교수로 설정하고 학술 검토용 문서 구조 강화:

- 교수님_검토용_요약.md 신규: 브리핑·검토 포인트 7개·의견란 9항목
- SDACS_특허명세서.md: 지도교수 검토 의견란·서명란 추가
- README.md: 검토 우선도 표기 및 검수자 안내 추가
- export/ 전체 재생성 (DOCX 6종 + PDF 6종)

Generated via: pandoc (docx) + weasyprint (pdf)
</commit_message>
<xml_diff>
--- a/docs/patent/export/SDACS_특허명세서.docx
+++ b/docs/patent/export/SDACS_특허명세서.docx
@@ -2,12 +2,495 @@
 <file path=word/document.xml><?xml version="1.0" encoding="utf-8"?>
 <w:document xmlns:w="http://schemas.openxmlformats.org/wordprocessingml/2006/main" xmlns:m="http://schemas.openxmlformats.org/officeDocument/2006/math" xmlns:r="http://schemas.openxmlformats.org/officeDocument/2006/relationships" xmlns:o="urn:schemas-microsoft-com:office:office" xmlns:v="urn:schemas-microsoft-com:vml" xmlns:w10="urn:schemas-microsoft-com:office:word" xmlns:a="http://schemas.openxmlformats.org/drawingml/2006/main" xmlns:pic="http://schemas.openxmlformats.org/drawingml/2006/picture" xmlns:wp="http://schemas.openxmlformats.org/drawingml/2006/wordprocessingDrawing">
   <w:body>
-    <w:bookmarkStart w:id="46" w:name="특허-명세서"/>
+    <w:bookmarkStart w:id="20" w:name="지도교수-검토용-특허-명세서-초안-sdacs"/>
     <w:p>
       <w:pPr>
         <w:pStyle w:val="Heading1"/>
       </w:pPr>
       <w:r>
+        <w:t xml:space="preserve">지도교수 검토용 특허 명세서 초안 (SDACS)</w:t>
+      </w:r>
+    </w:p>
+    <w:tbl>
+      <w:tblPr>
+        <w:tblStyle w:val="Table"/>
+        <w:tblW w:type="auto" w:w="0"/>
+        <w:tblLook w:firstRow="1" w:lastRow="0" w:firstColumn="0" w:lastColumn="0" w:noHBand="0" w:noVBand="0" w:val="0020"/>
+        <w:jc w:val="start"/>
+      </w:tblPr>
+      <w:tblGrid>
+        <w:gridCol w:w="3960"/>
+        <w:gridCol w:w="3960"/>
+      </w:tblGrid>
+      <w:tr>
+        <w:trPr>
+          <w:tblHeader w:val="true"/>
+        </w:trPr>
+        <w:tc>
+          <w:tcPr/>
+          <w:p>
+            <w:pPr>
+              <w:pStyle w:val="Compact"/>
+              <w:jc w:val="left"/>
+            </w:pPr>
+            <w:r>
+              <w:t xml:space="preserve">제출구분</w:t>
+            </w:r>
+          </w:p>
+        </w:tc>
+        <w:tc>
+          <w:tcPr/>
+          <w:p>
+            <w:pPr>
+              <w:pStyle w:val="Compact"/>
+              <w:jc w:val="left"/>
+            </w:pPr>
+            <w:r>
+              <w:t xml:space="preserve">캡스톤디자인 결과물 기반 특허 출원 명세서</w:t>
+            </w:r>
+          </w:p>
+        </w:tc>
+      </w:tr>
+      <w:tr>
+        <w:tc>
+          <w:tcPr/>
+          <w:p>
+            <w:pPr>
+              <w:pStyle w:val="Compact"/>
+              <w:jc w:val="left"/>
+            </w:pPr>
+            <w:r>
+              <w:t xml:space="preserve">문서 형태</w:t>
+            </w:r>
+          </w:p>
+        </w:tc>
+        <w:tc>
+          <w:tcPr/>
+          <w:p>
+            <w:pPr>
+              <w:pStyle w:val="Compact"/>
+              <w:jc w:val="left"/>
+            </w:pPr>
+            <w:r>
+              <w:t xml:space="preserve">특허 명세서 초안 (KIPO 양식)</w:t>
+            </w:r>
+          </w:p>
+        </w:tc>
+      </w:tr>
+      <w:tr>
+        <w:tc>
+          <w:tcPr/>
+          <w:p>
+            <w:pPr>
+              <w:pStyle w:val="Compact"/>
+              <w:jc w:val="left"/>
+            </w:pPr>
+            <w:r>
+              <w:t xml:space="preserve">제출자</w:t>
+            </w:r>
+          </w:p>
+        </w:tc>
+        <w:tc>
+          <w:tcPr/>
+          <w:p>
+            <w:pPr>
+              <w:pStyle w:val="Compact"/>
+              <w:jc w:val="left"/>
+            </w:pPr>
+            <w:r>
+              <w:t xml:space="preserve">장선우 (Jang Sunwoo)</w:t>
+            </w:r>
+          </w:p>
+        </w:tc>
+      </w:tr>
+      <w:tr>
+        <w:tc>
+          <w:tcPr/>
+          <w:p>
+            <w:pPr>
+              <w:pStyle w:val="Compact"/>
+              <w:jc w:val="left"/>
+            </w:pPr>
+            <w:r>
+              <w:t xml:space="preserve">지도교수</w:t>
+            </w:r>
+          </w:p>
+        </w:tc>
+        <w:tc>
+          <w:tcPr/>
+          <w:p>
+            <w:pPr>
+              <w:pStyle w:val="Compact"/>
+              <w:jc w:val="left"/>
+            </w:pPr>
+            <w:r>
+              <w:t xml:space="preserve">_________________ 교수님 귀하</w:t>
+            </w:r>
+          </w:p>
+        </w:tc>
+      </w:tr>
+      <w:tr>
+        <w:tc>
+          <w:tcPr/>
+          <w:p>
+            <w:pPr>
+              <w:pStyle w:val="Compact"/>
+              <w:jc w:val="left"/>
+            </w:pPr>
+            <w:r>
+              <w:t xml:space="preserve">소속</w:t>
+            </w:r>
+          </w:p>
+        </w:tc>
+        <w:tc>
+          <w:tcPr/>
+          <w:p>
+            <w:pPr>
+              <w:pStyle w:val="Compact"/>
+              <w:jc w:val="left"/>
+            </w:pPr>
+            <w:r>
+              <w:t xml:space="preserve">________________________________</w:t>
+            </w:r>
+          </w:p>
+        </w:tc>
+      </w:tr>
+      <w:tr>
+        <w:tc>
+          <w:tcPr/>
+          <w:p>
+            <w:pPr>
+              <w:pStyle w:val="Compact"/>
+              <w:jc w:val="left"/>
+            </w:pPr>
+            <w:r>
+              <w:t xml:space="preserve">작성일</w:t>
+            </w:r>
+          </w:p>
+        </w:tc>
+        <w:tc>
+          <w:tcPr/>
+          <w:p>
+            <w:pPr>
+              <w:pStyle w:val="Compact"/>
+              <w:jc w:val="left"/>
+            </w:pPr>
+            <w:r>
+              <w:t xml:space="preserve">2026년 4월 20일</w:t>
+            </w:r>
+          </w:p>
+        </w:tc>
+      </w:tr>
+      <w:tr>
+        <w:tc>
+          <w:tcPr/>
+          <w:p>
+            <w:pPr>
+              <w:pStyle w:val="Compact"/>
+              <w:jc w:val="left"/>
+            </w:pPr>
+            <w:r>
+              <w:t xml:space="preserve">문서 버전</w:t>
+            </w:r>
+          </w:p>
+        </w:tc>
+        <w:tc>
+          <w:tcPr/>
+          <w:p>
+            <w:pPr>
+              <w:pStyle w:val="Compact"/>
+              <w:jc w:val="left"/>
+            </w:pPr>
+            <w:r>
+              <w:t xml:space="preserve">v1.0 (초안)</w:t>
+            </w:r>
+          </w:p>
+        </w:tc>
+      </w:tr>
+      <w:tr>
+        <w:tc>
+          <w:tcPr/>
+          <w:p>
+            <w:pPr>
+              <w:pStyle w:val="Compact"/>
+              <w:jc w:val="left"/>
+            </w:pPr>
+            <w:r>
+              <w:t xml:space="preserve">검토 요청 사항</w:t>
+            </w:r>
+          </w:p>
+        </w:tc>
+        <w:tc>
+          <w:tcPr/>
+          <w:p>
+            <w:pPr>
+              <w:pStyle w:val="Compact"/>
+              <w:jc w:val="left"/>
+            </w:pPr>
+            <w:r>
+              <w:t xml:space="preserve">(1) 청구범위의 기술적 타당성 (2) 선행기술 대비 진보성 (3) 수치 한정의 과도성 여부</w:t>
+            </w:r>
+          </w:p>
+        </w:tc>
+      </w:tr>
+    </w:tbl>
+    <w:p>
+      <w:pPr>
+        <w:pStyle w:val="BlockText"/>
+      </w:pPr>
+      <w:r>
+        <w:rPr>
+          <w:bCs/>
+          <w:b/>
+        </w:rPr>
+        <w:t xml:space="preserve">검토 요청 요지</w:t>
+      </w:r>
+      <w:r>
+        <w:t xml:space="preserve">: 본 명세서는 「군집드론 공역통제 자동화 시스템(SDACS)」 캡스톤디자인 산출물을 특허 출원 양식으로 재구성한 초안입니다. 청구항의 구성 요소와 독립항의 권리범위, 수치 한정의 적정성에 대하여 지도교수님의 학술적·기술적 검토 의견을 요청드립니다.</w:t>
+      </w:r>
+    </w:p>
+    <w:p>
+      <w:pPr>
+        <w:pStyle w:val="FirstParagraph"/>
+      </w:pPr>
+      <w:r>
+        <w:rPr>
+          <w:bCs/>
+          <w:b/>
+        </w:rPr>
+        <w:t xml:space="preserve">【지도교수 검토 의견란】</w:t>
+      </w:r>
+    </w:p>
+    <w:tbl>
+      <w:tblPr>
+        <w:tblStyle w:val="Table"/>
+        <w:tblW w:type="auto" w:w="0"/>
+        <w:tblLook w:firstRow="1" w:lastRow="0" w:firstColumn="0" w:lastColumn="0" w:noHBand="0" w:noVBand="0" w:val="0020"/>
+        <w:jc w:val="start"/>
+      </w:tblPr>
+      <w:tblGrid>
+        <w:gridCol w:w="3960"/>
+        <w:gridCol w:w="3960"/>
+      </w:tblGrid>
+      <w:tr>
+        <w:trPr>
+          <w:tblHeader w:val="true"/>
+        </w:trPr>
+        <w:tc>
+          <w:tcPr/>
+          <w:p>
+            <w:pPr>
+              <w:pStyle w:val="Compact"/>
+              <w:jc w:val="left"/>
+            </w:pPr>
+            <w:r>
+              <w:t xml:space="preserve">항목</w:t>
+            </w:r>
+          </w:p>
+        </w:tc>
+        <w:tc>
+          <w:tcPr/>
+          <w:p>
+            <w:pPr>
+              <w:pStyle w:val="Compact"/>
+              <w:jc w:val="left"/>
+            </w:pPr>
+            <w:r>
+              <w:t xml:space="preserve">검토 의견</w:t>
+            </w:r>
+          </w:p>
+        </w:tc>
+      </w:tr>
+      <w:tr>
+        <w:tc>
+          <w:tcPr/>
+          <w:p>
+            <w:pPr>
+              <w:pStyle w:val="Compact"/>
+              <w:jc w:val="left"/>
+            </w:pPr>
+            <w:r>
+              <w:t xml:space="preserve">1. 기술 분야 적정성</w:t>
+            </w:r>
+          </w:p>
+        </w:tc>
+        <w:tc>
+          <w:tcPr/>
+          <w:p>
+            <w:pPr>
+              <w:pStyle w:val="Compact"/>
+            </w:pPr>
+          </w:p>
+        </w:tc>
+      </w:tr>
+      <w:tr>
+        <w:tc>
+          <w:tcPr/>
+          <w:p>
+            <w:pPr>
+              <w:pStyle w:val="Compact"/>
+              <w:jc w:val="left"/>
+            </w:pPr>
+            <w:r>
+              <w:t xml:space="preserve">2. 청구항 1(독립항) 구성 요소</w:t>
+            </w:r>
+          </w:p>
+        </w:tc>
+        <w:tc>
+          <w:tcPr/>
+          <w:p>
+            <w:pPr>
+              <w:pStyle w:val="Compact"/>
+            </w:pPr>
+          </w:p>
+        </w:tc>
+      </w:tr>
+      <w:tr>
+        <w:tc>
+          <w:tcPr/>
+          <w:p>
+            <w:pPr>
+              <w:pStyle w:val="Compact"/>
+              <w:jc w:val="left"/>
+            </w:pPr>
+            <w:r>
+              <w:t xml:space="preserve">3. 청구항 2~5 종속항 범위</w:t>
+            </w:r>
+          </w:p>
+        </w:tc>
+        <w:tc>
+          <w:tcPr/>
+          <w:p>
+            <w:pPr>
+              <w:pStyle w:val="Compact"/>
+            </w:pPr>
+          </w:p>
+        </w:tc>
+      </w:tr>
+      <w:tr>
+        <w:tc>
+          <w:tcPr/>
+          <w:p>
+            <w:pPr>
+              <w:pStyle w:val="Compact"/>
+              <w:jc w:val="left"/>
+            </w:pPr>
+            <w:r>
+              <w:t xml:space="preserve">4. 수치 한정의 타당성 (97.8%, 10 m/s, 38,400회 등)</w:t>
+            </w:r>
+          </w:p>
+        </w:tc>
+        <w:tc>
+          <w:tcPr/>
+          <w:p>
+            <w:pPr>
+              <w:pStyle w:val="Compact"/>
+            </w:pPr>
+          </w:p>
+        </w:tc>
+      </w:tr>
+      <w:tr>
+        <w:tc>
+          <w:tcPr/>
+          <w:p>
+            <w:pPr>
+              <w:pStyle w:val="Compact"/>
+              <w:jc w:val="left"/>
+            </w:pPr>
+            <w:r>
+              <w:t xml:space="preserve">5. 선행기술 차별성</w:t>
+            </w:r>
+          </w:p>
+        </w:tc>
+        <w:tc>
+          <w:tcPr/>
+          <w:p>
+            <w:pPr>
+              <w:pStyle w:val="Compact"/>
+            </w:pPr>
+          </w:p>
+        </w:tc>
+      </w:tr>
+      <w:tr>
+        <w:tc>
+          <w:tcPr/>
+          <w:p>
+            <w:pPr>
+              <w:pStyle w:val="Compact"/>
+              <w:jc w:val="left"/>
+            </w:pPr>
+            <w:r>
+              <w:t xml:space="preserve">6. 도면 7매의 기술적 표현</w:t>
+            </w:r>
+          </w:p>
+        </w:tc>
+        <w:tc>
+          <w:tcPr/>
+          <w:p>
+            <w:pPr>
+              <w:pStyle w:val="Compact"/>
+            </w:pPr>
+          </w:p>
+        </w:tc>
+      </w:tr>
+      <w:tr>
+        <w:tc>
+          <w:tcPr/>
+          <w:p>
+            <w:pPr>
+              <w:pStyle w:val="Compact"/>
+              <w:jc w:val="left"/>
+            </w:pPr>
+            <w:r>
+              <w:t xml:space="preserve">7. 종합 평가 및 수정 권고</w:t>
+            </w:r>
+          </w:p>
+        </w:tc>
+        <w:tc>
+          <w:tcPr/>
+          <w:p>
+            <w:pPr>
+              <w:pStyle w:val="Compact"/>
+            </w:pPr>
+          </w:p>
+        </w:tc>
+      </w:tr>
+    </w:tbl>
+    <w:p>
+      <w:pPr>
+        <w:pStyle w:val="BodyText"/>
+      </w:pPr>
+      <w:r>
+        <w:t xml:space="preserve">서명: _______________________ (지도교수)</w:t>
+      </w:r>
+      <w:r>
+        <w:t xml:space="preserve"> </w:t>
+      </w:r>
+      <w:r>
+        <w:t xml:space="preserve">검토일: 2026-</w:t>
+      </w:r>
+      <w:r>
+        <w:rPr>
+          <w:bCs/>
+          <w:b/>
+        </w:rPr>
+        <w:t xml:space="preserve">-</w:t>
+      </w:r>
+    </w:p>
+    <w:p>
+      <w:r>
+        <w:pict>
+          <v:rect style="width:0;height:1.5pt" o:hralign="center" o:hrstd="t" o:hr="t"/>
+        </w:pict>
+      </w:r>
+    </w:p>
+    <w:bookmarkEnd w:id="20"/>
+    <w:bookmarkStart w:id="47" w:name="특허-명세서"/>
+    <w:p>
+      <w:pPr>
+        <w:pStyle w:val="Heading1"/>
+      </w:pPr>
+      <w:r>
         <w:t xml:space="preserve">특허 명세서</w:t>
       </w:r>
     </w:p>
@@ -76,13 +559,29 @@
           <w:bCs/>
           <w:b/>
         </w:rPr>
+        <w:t xml:space="preserve">【지도교수】</w:t>
+      </w:r>
+      <w:r>
+        <w:t xml:space="preserve"> </w:t>
+      </w:r>
+      <w:r>
+        <w:t xml:space="preserve">_________________ (캡스톤디자인 지도교수)</w:t>
+      </w:r>
+      <w:r>
+        <w:t xml:space="preserve"> </w:t>
+      </w:r>
+      <w:r>
+        <w:rPr>
+          <w:bCs/>
+          <w:b/>
+        </w:rPr>
         <w:t xml:space="preserve">【대리인】</w:t>
       </w:r>
       <w:r>
         <w:t xml:space="preserve"> </w:t>
       </w:r>
       <w:r>
-        <w:t xml:space="preserve">(대리인 정보 기재)</w:t>
+        <w:t xml:space="preserve">(변리사 선임 후 기재)</w:t>
       </w:r>
       <w:r>
         <w:t xml:space="preserve"> </w:t>
@@ -173,7 +672,7 @@
         </w:pict>
       </w:r>
     </w:p>
-    <w:bookmarkStart w:id="20" w:name="요약서"/>
+    <w:bookmarkStart w:id="21" w:name="요약서"/>
     <w:p>
       <w:pPr>
         <w:pStyle w:val="Heading2"/>
@@ -275,8 +774,8 @@
         </w:pict>
       </w:r>
     </w:p>
-    <w:bookmarkEnd w:id="20"/>
-    <w:bookmarkStart w:id="21" w:name="기술분야"/>
+    <w:bookmarkEnd w:id="21"/>
+    <w:bookmarkStart w:id="22" w:name="기술분야"/>
     <w:p>
       <w:pPr>
         <w:pStyle w:val="Heading2"/>
@@ -329,8 +828,8 @@
         </w:pict>
       </w:r>
     </w:p>
-    <w:bookmarkEnd w:id="21"/>
-    <w:bookmarkStart w:id="22" w:name="발명의-배경이-되는-기술"/>
+    <w:bookmarkEnd w:id="22"/>
+    <w:bookmarkStart w:id="23" w:name="발명의-배경이-되는-기술"/>
     <w:p>
       <w:pPr>
         <w:pStyle w:val="Heading2"/>
@@ -489,8 +988,8 @@
         </w:pict>
       </w:r>
     </w:p>
-    <w:bookmarkEnd w:id="22"/>
-    <w:bookmarkStart w:id="26" w:name="발명의-내용"/>
+    <w:bookmarkEnd w:id="23"/>
+    <w:bookmarkStart w:id="27" w:name="발명의-내용"/>
     <w:p>
       <w:pPr>
         <w:pStyle w:val="Heading2"/>
@@ -499,7 +998,7 @@
         <w:t xml:space="preserve">【발명의 내용】</w:t>
       </w:r>
     </w:p>
-    <w:bookmarkStart w:id="23" w:name="해결하려는-과제"/>
+    <w:bookmarkStart w:id="24" w:name="해결하려는-과제"/>
     <w:p>
       <w:pPr>
         <w:pStyle w:val="Heading3"/>
@@ -639,8 +1138,8 @@
         <w:t xml:space="preserve">: 풍속·돌풍 등 **기상 조건 변화에 강건(robust)**한 충돌 회피 파라미터 자동 전환 메커니즘 제공.</w:t>
       </w:r>
     </w:p>
-    <w:bookmarkEnd w:id="23"/>
-    <w:bookmarkStart w:id="24" w:name="과제의-해결-수단"/>
+    <w:bookmarkEnd w:id="24"/>
+    <w:bookmarkStart w:id="25" w:name="과제의-해결-수단"/>
     <w:p>
       <w:pPr>
         <w:pStyle w:val="Heading3"/>
@@ -925,8 +1424,8 @@
         <w:t xml:space="preserve">: Dash 3D 대시보드 및 명령행 제어 인터페이스</w:t>
       </w:r>
     </w:p>
-    <w:bookmarkEnd w:id="24"/>
-    <w:bookmarkStart w:id="25" w:name="발명의-효과"/>
+    <w:bookmarkEnd w:id="25"/>
+    <w:bookmarkStart w:id="26" w:name="발명의-효과"/>
     <w:p>
       <w:pPr>
         <w:pStyle w:val="Heading3"/>
@@ -1088,9 +1587,9 @@
         </w:pict>
       </w:r>
     </w:p>
-    <w:bookmarkEnd w:id="25"/>
     <w:bookmarkEnd w:id="26"/>
-    <w:bookmarkStart w:id="27" w:name="도면의-간단한-설명"/>
+    <w:bookmarkEnd w:id="27"/>
+    <w:bookmarkStart w:id="28" w:name="도면의-간단한-설명"/>
     <w:p>
       <w:pPr>
         <w:pStyle w:val="Heading2"/>
@@ -1260,8 +1759,8 @@
         </w:pict>
       </w:r>
     </w:p>
-    <w:bookmarkEnd w:id="27"/>
-    <w:bookmarkStart w:id="34" w:name="발명을-실시하기-위한-구체적인-내용"/>
+    <w:bookmarkEnd w:id="28"/>
+    <w:bookmarkStart w:id="35" w:name="발명을-실시하기-위한-구체적인-내용"/>
     <w:p>
       <w:pPr>
         <w:pStyle w:val="Heading2"/>
@@ -1270,7 +1769,7 @@
         <w:t xml:space="preserve">【발명을 실시하기 위한 구체적인 내용】</w:t>
       </w:r>
     </w:p>
-    <w:bookmarkStart w:id="28" w:name="Xb6b902e738ce8161a43dffa4d3f018f88d8c87b"/>
+    <w:bookmarkStart w:id="29" w:name="Xb6b902e738ce8161a43dffa4d3f018f88d8c87b"/>
     <w:p>
       <w:pPr>
         <w:pStyle w:val="Heading3"/>
@@ -1581,8 +2080,8 @@
         </w:tc>
       </w:tr>
     </w:tbl>
-    <w:bookmarkEnd w:id="28"/>
-    <w:bookmarkStart w:id="29" w:name="X41f742457d9e880355e8bf2b93d228008ee30e6"/>
+    <w:bookmarkEnd w:id="29"/>
+    <w:bookmarkStart w:id="30" w:name="X41f742457d9e880355e8bf2b93d228008ee30e6"/>
     <w:p>
       <w:pPr>
         <w:pStyle w:val="Heading3"/>
@@ -1694,8 +2193,8 @@
         <w:t xml:space="preserve">: TTL 경과 시 자동 제거.</w:t>
       </w:r>
     </w:p>
-    <w:bookmarkEnd w:id="29"/>
-    <w:bookmarkStart w:id="30" w:name="X9320ecf06e6ebf9d8297de6f96ae484ee73e9f2"/>
+    <w:bookmarkEnd w:id="30"/>
+    <w:bookmarkStart w:id="31" w:name="X9320ecf06e6ebf9d8297de6f96ae484ee73e9f2"/>
     <w:p>
       <w:pPr>
         <w:pStyle w:val="Heading3"/>
@@ -1813,8 +2312,8 @@
         <w:t xml:space="preserve">        self.planned_path = new_path</w:t>
       </w:r>
     </w:p>
-    <w:bookmarkEnd w:id="30"/>
-    <w:bookmarkStart w:id="31" w:name="X5e47a6b26737f4954e9006de03ffd9302f47210"/>
+    <w:bookmarkEnd w:id="31"/>
+    <w:bookmarkStart w:id="32" w:name="X5e47a6b26737f4954e9006de03ffd9302f47210"/>
     <w:p>
       <w:pPr>
         <w:pStyle w:val="Heading3"/>
@@ -2049,8 +2548,8 @@
         </w:tc>
       </w:tr>
     </w:tbl>
-    <w:bookmarkEnd w:id="31"/>
-    <w:bookmarkStart w:id="32" w:name="Xf9d2f6062b431cc57af2540369b42b6fd8bad50"/>
+    <w:bookmarkEnd w:id="32"/>
+    <w:bookmarkStart w:id="33" w:name="Xf9d2f6062b431cc57af2540369b42b6fd8bad50"/>
     <w:p>
       <w:pPr>
         <w:pStyle w:val="Heading3"/>
@@ -2067,8 +2566,8 @@
         <w:t xml:space="preserve">[0030] WebGPU Compute Shader는 드론 N대의 위치 벡터를 GPU 버퍼로 일괄 업로드한 뒤, 각 작업그룹(Workgroup)이 독립적으로 APF 힘 벡터를 계산한다. 메모리 접근 패턴은 coalesced access를 보장하도록 배치되며, 계산 결과는 CPU로 다시 회신되어 제어 명령으로 변환된다.</w:t>
       </w:r>
     </w:p>
-    <w:bookmarkEnd w:id="32"/>
-    <w:bookmarkStart w:id="33" w:name="X924538d3758383966917ff34fde0799cdeb8c9c"/>
+    <w:bookmarkEnd w:id="33"/>
+    <w:bookmarkStart w:id="34" w:name="X924538d3758383966917ff34fde0799cdeb8c9c"/>
     <w:p>
       <w:pPr>
         <w:pStyle w:val="Heading3"/>
@@ -2149,9 +2648,9 @@
         </w:pict>
       </w:r>
     </w:p>
-    <w:bookmarkEnd w:id="33"/>
     <w:bookmarkEnd w:id="34"/>
-    <w:bookmarkStart w:id="43" w:name="청구범위"/>
+    <w:bookmarkEnd w:id="35"/>
+    <w:bookmarkStart w:id="44" w:name="청구범위"/>
     <w:p>
       <w:pPr>
         <w:pStyle w:val="Heading2"/>
@@ -2160,7 +2659,7 @@
         <w:t xml:space="preserve">【청구범위】</w:t>
       </w:r>
     </w:p>
-    <w:bookmarkStart w:id="35" w:name="청구항-1-독립항--시스템"/>
+    <w:bookmarkStart w:id="36" w:name="청구항-1-독립항--시스템"/>
     <w:p>
       <w:pPr>
         <w:pStyle w:val="Heading3"/>
@@ -2281,8 +2780,8 @@
         <w:t xml:space="preserve">을 포함하는 군집 드론 공역 통제 시스템.</w:t>
       </w:r>
     </w:p>
-    <w:bookmarkEnd w:id="35"/>
-    <w:bookmarkStart w:id="36" w:name="청구항-2-종속항--기상-적응"/>
+    <w:bookmarkEnd w:id="36"/>
+    <w:bookmarkStart w:id="37" w:name="청구항-2-종속항--기상-적응"/>
     <w:p>
       <w:pPr>
         <w:pStyle w:val="Heading3"/>
@@ -2332,8 +2831,8 @@
         <w:t xml:space="preserve">을 더 포함하는 것을 특징으로 하는 군집 드론 공역 통제 시스템.</w:t>
       </w:r>
     </w:p>
-    <w:bookmarkEnd w:id="36"/>
-    <w:bookmarkStart w:id="37" w:name="청구항-3-종속항--4계층-구조"/>
+    <w:bookmarkEnd w:id="37"/>
+    <w:bookmarkStart w:id="38" w:name="청구항-3-종속항--4계층-구조"/>
     <w:p>
       <w:pPr>
         <w:pStyle w:val="Heading3"/>
@@ -2394,8 +2893,8 @@
         <w:t xml:space="preserve">사용자 명령과 3D 시각화를 제공하는 운영 인터페이스 계층의 4계층으로 구성되는 것을 특징으로 하는 군집 드론 공역 통제 시스템.</w:t>
       </w:r>
     </w:p>
-    <w:bookmarkEnd w:id="37"/>
-    <w:bookmarkStart w:id="38" w:name="청구항-4-종속항--분산-자율성"/>
+    <w:bookmarkEnd w:id="38"/>
+    <w:bookmarkStart w:id="39" w:name="청구항-4-종속항--분산-자율성"/>
     <w:p>
       <w:pPr>
         <w:pStyle w:val="Heading3"/>
@@ -2432,8 +2931,8 @@
         <w:t xml:space="preserve">상기 분산 CD&amp;R 모듈은 통신 단절 상황에서도 각 드론의 로컬 캐시된 공역 상태를 기반으로 회피 동작을 유지하도록 구성된 것을 특징으로 하는 군집 드론 공역 통제 시스템.</w:t>
       </w:r>
     </w:p>
-    <w:bookmarkEnd w:id="38"/>
-    <w:bookmarkStart w:id="39" w:name="청구항-5-종속항--펜스-유효성"/>
+    <w:bookmarkEnd w:id="39"/>
+    <w:bookmarkStart w:id="40" w:name="청구항-5-종속항--펜스-유효성"/>
     <w:p>
       <w:pPr>
         <w:pStyle w:val="Heading3"/>
@@ -2470,8 +2969,8 @@
         <w:t xml:space="preserve">상기 동적 지오펜싱 모듈은 생성된 가상 위험 펜스에 유효 시간(TTL: Time-To-Live)을 부여하고, 유효 시간 경과 시 해당 펜스를 공역 상태 저장소에서 자동 제거하는 것을 특징으로 하는 군집 드론 공역 통제 시스템.</w:t>
       </w:r>
     </w:p>
-    <w:bookmarkEnd w:id="39"/>
-    <w:bookmarkStart w:id="40" w:name="청구항-6-독립항--방법"/>
+    <w:bookmarkEnd w:id="40"/>
+    <w:bookmarkStart w:id="41" w:name="청구항-6-독립항--방법"/>
     <w:p>
       <w:pPr>
         <w:pStyle w:val="Heading3"/>
@@ -2540,8 +3039,8 @@
         <w:t xml:space="preserve">를 포함하는 군집 드론 공역 통제 자동화 방법.</w:t>
       </w:r>
     </w:p>
-    <w:bookmarkEnd w:id="40"/>
-    <w:bookmarkStart w:id="41" w:name="청구항-7-종속항--강풍-모드"/>
+    <w:bookmarkEnd w:id="41"/>
+    <w:bookmarkStart w:id="42" w:name="청구항-7-종속항--강풍-모드"/>
     <w:p>
       <w:pPr>
         <w:pStyle w:val="Heading3"/>
@@ -2578,8 +3077,8 @@
         <w:t xml:space="preserve">상기 (d) 단계는 풍속 측정값이 10 m/s를 초과하는 경우, 상기 반발력의 이득값을 기본 모드 대비 1.5배 이상으로 상향하는 단계를 포함하는 것을 특징으로 하는 군집 드론 공역 통제 자동화 방법.</w:t>
       </w:r>
     </w:p>
-    <w:bookmarkEnd w:id="41"/>
-    <w:bookmarkStart w:id="42" w:name="청구항-8-종속항--매체"/>
+    <w:bookmarkEnd w:id="42"/>
+    <w:bookmarkStart w:id="43" w:name="청구항-8-종속항--매체"/>
     <w:p>
       <w:pPr>
         <w:pStyle w:val="Heading3"/>
@@ -2617,9 +3116,9 @@
         </w:pict>
       </w:r>
     </w:p>
-    <w:bookmarkEnd w:id="42"/>
     <w:bookmarkEnd w:id="43"/>
-    <w:bookmarkStart w:id="44" w:name="부록-a-용어-정의"/>
+    <w:bookmarkEnd w:id="44"/>
+    <w:bookmarkStart w:id="45" w:name="부록-a-용어-정의"/>
     <w:p>
       <w:pPr>
         <w:pStyle w:val="Heading2"/>
@@ -2711,8 +3210,8 @@
         </w:pict>
       </w:r>
     </w:p>
-    <w:bookmarkEnd w:id="44"/>
-    <w:bookmarkStart w:id="45" w:name="부록-b-작성-안내-출원-전-확인-사항"/>
+    <w:bookmarkEnd w:id="45"/>
+    <w:bookmarkStart w:id="46" w:name="부록-b-작성-안내-출원-전-확인-사항"/>
     <w:p>
       <w:pPr>
         <w:pStyle w:val="Heading2"/>
@@ -2900,8 +3399,8 @@
         <w:t xml:space="preserve">docs/architecture.md</w:t>
       </w:r>
     </w:p>
-    <w:bookmarkEnd w:id="45"/>
     <w:bookmarkEnd w:id="46"/>
+    <w:bookmarkEnd w:id="47"/>
     <w:sectPr/>
   </w:body>
 </w:document>

</xml_diff>